<commit_message>
Relatorio com foco operacional: modelo assertivo para o CITRA real
</commit_message>
<xml_diff>
--- a/docs/Relatorio_CrossDomain_Marinha.docx
+++ b/docs/Relatorio_CrossDomain_Marinha.docx
@@ -38,7 +38,7 @@
     </w:p>
     <w:p>
       <w:pPr>
-        <w:spacing w:after="240"/>
+        <w:spacing w:after="60"/>
         <w:jc w:val="center"/>
       </w:pPr>
       <w:r>
@@ -50,7 +50,90 @@
           <w:sz w:val="22"/>
           <w:szCs w:val="22"/>
         </w:rPr>
-        <w:t xml:space="preserve">Relatório de resultados e proposta de próximo experimento</w:t>
+        <w:t xml:space="preserve">Como aumentar o dataset para um modelo operacional mais assertivo no CITRA real</w:t>
+      </w:r>
+    </w:p>
+    <w:p>
+      <w:pPr>
+        <w:spacing w:after="240"/>
+        <w:jc w:val="center"/>
+      </w:pPr>
+      <w:r>
+        <w:rPr>
+          <w:rFonts w:ascii="Calibri" w:cs="Calibri" w:eastAsia="Calibri" w:hAnsi="Calibri"/>
+          <w:color w:val="1565c0"/>
+          <w:sz w:val="18"/>
+          <w:szCs w:val="18"/>
+        </w:rPr>
+        <w:t xml:space="preserve">Repositório: github.com/DanielaLFreire/maritime-crossdomain</w:t>
+      </w:r>
+    </w:p>
+    <w:tbl>
+      <w:tblPr>
+        <w:tblW w:type="dxa" w:w="9000"/>
+        <w:tblBorders>
+          <w:top w:val="single" w:color="auto" w:sz="4"/>
+          <w:left w:val="single" w:color="auto" w:sz="4"/>
+          <w:bottom w:val="single" w:color="auto" w:sz="4"/>
+          <w:right w:val="single" w:color="auto" w:sz="4"/>
+          <w:insideH w:val="single" w:color="auto" w:sz="4"/>
+          <w:insideV w:val="single" w:color="auto" w:sz="4"/>
+        </w:tblBorders>
+      </w:tblPr>
+      <w:tblGrid>
+        <w:gridCol w:w="9000"/>
+      </w:tblGrid>
+      <w:tr>
+        <w:tc>
+          <w:tcPr>
+            <w:tcW w:type="dxa" w:w="9000"/>
+            <w:shd w:fill="fff8e1" w:val="clear"/>
+            <w:tcMar>
+              <w:top w:type="dxa" w:w="120"/>
+              <w:left w:type="dxa" w:w="160"/>
+              <w:bottom w:type="dxa" w:w="120"/>
+              <w:right w:type="dxa" w:w="160"/>
+            </w:tcMar>
+          </w:tcPr>
+          <w:p>
+            <w:pPr>
+              <w:spacing w:after="60"/>
+            </w:pPr>
+            <w:r>
+              <w:rPr>
+                <w:rFonts w:ascii="Calibri" w:cs="Calibri" w:eastAsia="Calibri" w:hAnsi="Calibri"/>
+                <w:b/>
+                <w:bCs/>
+                <w:color w:val="e65100"/>
+                <w:sz w:val="22"/>
+                <w:szCs w:val="22"/>
+              </w:rPr>
+              <w:t xml:space="preserve">Objetivo</w:t>
+            </w:r>
+          </w:p>
+          <w:p>
+            <w:r>
+              <w:rPr>
+                <w:rFonts w:ascii="Calibri" w:cs="Calibri" w:eastAsia="Calibri" w:hAnsi="Calibri"/>
+                <w:sz w:val="21"/>
+                <w:szCs w:val="21"/>
+              </w:rPr>
+              <w:t xml:space="preserve">Construir um modelo operacional que detecte embarcações nas imagens reais do CITRA-3D com o máximo de assertividade. O dataset operacional é pequeno e restrito; a questão de engenharia é como aumentá-lo — com quais dados e por qual método — para o modelo acertar mais na operação real. As publicações são um subproduto formal do trabalho; o produto é o modelo.</w:t>
+            </w:r>
+          </w:p>
+        </w:tc>
+      </w:tr>
+    </w:tbl>
+    <w:p>
+      <w:pPr>
+        <w:spacing w:after="160"/>
+      </w:pPr>
+      <w:r>
+        <w:rPr>
+          <w:sz w:val="8"/>
+          <w:szCs w:val="8"/>
+        </w:rPr>
+        <w:t xml:space="preserve"/>
       </w:r>
     </w:p>
     <w:p>
@@ -62,7 +145,7 @@
         <w:rPr>
           <w:rFonts w:ascii="Calibri" w:cs="Calibri" w:eastAsia="Calibri" w:hAnsi="Calibri"/>
         </w:rPr>
-        <w:t xml:space="preserve">1. Retrospectiva — o experimento do artigo (SIBGRAPI 2026)</w:t>
+        <w:t xml:space="preserve">1. Retrospectiva — o que já sabíamos (do primeiro estudo)</w:t>
       </w:r>
     </w:p>
     <w:p>
@@ -226,7 +309,7 @@
         <w:rPr>
           <w:rFonts w:ascii="Calibri" w:cs="Calibri" w:eastAsia="Calibri" w:hAnsi="Calibri"/>
         </w:rPr>
-        <w:t xml:space="preserve">2.1. Resultado in-domain (no próprio CITRA)</w:t>
+        <w:t xml:space="preserve">2.1. Resultado no CITRA — o cenário-alvo da operação</w:t>
       </w:r>
     </w:p>
     <w:p>
@@ -239,7 +322,7 @@
           <w:sz w:val="22"/>
           <w:szCs w:val="22"/>
         </w:rPr>
-        <w:t xml:space="preserve">Avaliando no conjunto de teste do CITRA (embarcações pequenas), a síntese venceu:</w:t>
+        <w:t xml:space="preserve">Este é o resultado que mais importa: o desempenho no próprio CITRA, que é o domínio real de emprego. Avaliando no conjunto de teste do CITRA (embarcações pequenas, vigilância), a síntese foi a melhor estratégia de aumento:</w:t>
       </w:r>
     </w:p>
     <w:tbl>
@@ -806,7 +889,7 @@
         <w:rPr>
           <w:rFonts w:ascii="Calibri" w:cs="Calibri" w:eastAsia="Calibri" w:hAnsi="Calibri"/>
         </w:rPr>
-        <w:t xml:space="preserve">2.2. Resultado de generalização (num dataset nunca visto: SeaShips)</w:t>
+        <w:t xml:space="preserve">2.2. Teste-diagnóstico num domínio diferente (SeaShips)</w:t>
       </w:r>
     </w:p>
     <w:p>
@@ -819,7 +902,7 @@
           <w:sz w:val="22"/>
           <w:szCs w:val="22"/>
         </w:rPr>
-        <w:t xml:space="preserve">Para testar se o efeito vale além do CITRA, avaliamos os modelos, sem nenhum novo treino, no SeaShips — um dataset independente de câmera costeira (6.979 imagens). Aqui o resultado se inverteu:</w:t>
+        <w:t xml:space="preserve">Para entender o comportamento dos modelos, avaliamos em um domínio propositalmente diferente — o SeaShips, câmera costeira com embarcações grandes (6.979 imagens, sem novo treino). O SeaShips NÃO é o cenário de emprego; serve como sonda para revelar o que cada estratégia aprende. E aqui o resultado se inverteu:</w:t>
       </w:r>
     </w:p>
     <w:tbl>
@@ -1377,7 +1460,7 @@
           <w:sz w:val="20"/>
           <w:szCs w:val="20"/>
         </w:rPr>
-        <w:t xml:space="preserve">Agora o co-treino real (C-joint) lidera. A síntese ainda supera a base e tem o melhor recall (detecta mais embarcações), mas não domina mais. C-pre continua sendo a pior escolha.</w:t>
+        <w:t xml:space="preserve">Num domínio de embarcações grandes, o co-treino real (C-joint) lidera. Isso NÃO significa trocar de estratégia para a operação — significa que cada método aprende uma escala diferente. A leitura correta vem a seguir.</w:t>
       </w:r>
     </w:p>
     <w:p>
@@ -1650,7 +1733,7 @@
                 <w:sz w:val="22"/>
                 <w:szCs w:val="22"/>
               </w:rPr>
-              <w:t xml:space="preserve">A estratégia de aumento de dados ideal depende da escala das embarcações no cenário de emprego real.</w:t>
+              <w:t xml:space="preserve">Recomendação para o modelo operacional do CITRA: usar a síntese in-place (A_joint_ABO).</w:t>
             </w:r>
           </w:p>
           <w:p>
@@ -1663,7 +1746,7 @@
                 <w:sz w:val="21"/>
                 <w:szCs w:val="21"/>
               </w:rPr>
-              <w:t xml:space="preserve">• Alvo pequeno/distante (vigilância de longo alcance, como o CITRA): síntese in-place é a melhor escolha.</w:t>
+              <w:t xml:space="preserve">O CITRA é dominado por embarcações pequenas — exatamente o regime em que a síntese vence. Como o alvo real de emprego é o CITRA, a síntese é a escolha certa para o modelo em produção. É também a que entrega o maior recall no CITRA (detecta mais embarcações, o que mais importa em vigilância).</w:t>
             </w:r>
           </w:p>
           <w:p>
@@ -1673,7 +1756,7 @@
                 <w:sz w:val="21"/>
                 <w:szCs w:val="21"/>
               </w:rPr>
-              <w:t xml:space="preserve">• Alvo grande/próximo (cenário costeiro, como o SeaShips): co-treino com dados reais da fonte generaliza melhor.</w:t>
+              <w:t xml:space="preserve">A vantagem do co-treino real aparece só em domínios de embarcações grandes (como o SeaShips), que não é o cenário de emprego. Esse dado é útil para o futuro: se a operação passar a incluir alvos maiores/próximos, a estratégia deve ser revista.</w:t>
             </w:r>
           </w:p>
         </w:tc>
@@ -1691,7 +1774,7 @@
           <w:sz w:val="22"/>
           <w:szCs w:val="22"/>
         </w:rPr>
-        <w:t xml:space="preserve">Em todos os casos, o pré-treino direto (C-pre) é a pior opção e deve ser evitado.</w:t>
+        <w:t xml:space="preserve">Em todos os casos, o pré-treino direto no dado público (C-pre) é a pior opção e deve ser evitado no pipeline operacional.</w:t>
       </w:r>
     </w:p>
     <w:p>
@@ -1716,7 +1799,7 @@
           <w:sz w:val="22"/>
           <w:szCs w:val="22"/>
         </w:rPr>
-        <w:t xml:space="preserve">A descoberta acima sugere uma pergunta natural e operacionalmente valiosa: e se combinarmos fontes de escalas diferentes na síntese? Um modelo exposto a embarcações sintéticas de múltiplas fontes seria mais robusto a variação de escala — acertando bem tanto no pequeno quanto no grande?</w:t>
+        <w:t xml:space="preserve">A pergunta que serve diretamente ao modelo operacional: adicionar crops sintéticos de mais de uma fonte torna o modelo do CITRA ainda mais assertivo? Mais variedade de aparência de embarcação — sem sair da escala pequena do CITRA — pode aumentar o acerto na operação real, especialmente em condições que o dataset atual cobre pouco.</w:t>
       </w:r>
     </w:p>
     <w:p>
@@ -1729,7 +1812,7 @@
           <w:sz w:val="22"/>
           <w:szCs w:val="22"/>
         </w:rPr>
-        <w:t xml:space="preserve">A ideia é compor o CITRA com crops sintéticos de DUAS fontes de escalas distintas (ABOShips + SMD on-shore, esta última de escala intermediária) e avaliar em ambos os regimes (CITRA pequeno + SeaShips grande).</w:t>
+        <w:t xml:space="preserve">A ideia é compor o CITRA com crops sintéticos de DUAS fontes (ABOShips + SMD on-shore), sempre coladas na escala do CITRA, e medir o ganho no PRÓPRIO CITRA (o alvo). O SeaShips entra apenas como sonda-diagnóstico secundária.</w:t>
       </w:r>
     </w:p>
     <w:p>
@@ -2141,7 +2224,7 @@
           <w:sz w:val="22"/>
           <w:szCs w:val="22"/>
         </w:rPr>
-        <w:t xml:space="preserve">Se multi-fonte &gt; controle em AMBOS os domínios: a diversidade de escala produz um modelo mais robusto — recomendação direta para o pipeline da Marinha.</w:t>
+        <w:t xml:space="preserve">Se multi-fonte &gt; controle no CITRA: adotar composição multi-fonte no pipeline operacional — modelo mais assertivo na operação real.</w:t>
       </w:r>
     </w:p>
     <w:p>
@@ -2159,7 +2242,7 @@
           <w:sz w:val="22"/>
           <w:szCs w:val="22"/>
         </w:rPr>
-        <w:t xml:space="preserve">Se forem equivalentes: o ganho vem do volume, não da diversidade — e basta escalar uma fonte. Igualmente acionável.</w:t>
+        <w:t xml:space="preserve">Se forem equivalentes: o ganho vinha do volume, não da diversidade — basta escalar uma fonte, mais simples de manter em produção.</w:t>
       </w:r>
     </w:p>
     <w:p>
@@ -2177,7 +2260,7 @@
           <w:sz w:val="22"/>
           <w:szCs w:val="22"/>
         </w:rPr>
-        <w:t xml:space="preserve">Se multi-fonte ajuda só num regime: refina ainda mais a regra de qual estratégia usar para qual cenário.</w:t>
+        <w:t xml:space="preserve">Em qualquer caso, a decisão é sobre COMO montar o dataset de treino do modelo em produção — não um exercício acadêmico.</w:t>
       </w:r>
     </w:p>
     <w:p>
@@ -2192,7 +2275,7 @@
           <w:sz w:val="20"/>
           <w:szCs w:val="20"/>
         </w:rPr>
-        <w:t xml:space="preserve">Custo estimado: 3 braços × 3 repetições em GPU (A100), reaproveitando toda a infraestrutura já construída. Sem prazo de submissão — o foco é a robustez da recomendação para o projeto.</w:t>
+        <w:t xml:space="preserve">Custo estimado: 3 braços × 3 repetições em GPU (A100), reaproveitando toda a infraestrutura já construída. O foco é a decisão de engenharia: qual composição de dataset produz o modelo operacional mais assertivo no CITRA.</w:t>
       </w:r>
     </w:p>
     <w:p>
@@ -2204,20 +2287,107 @@
         <w:rPr>
           <w:rFonts w:ascii="Calibri" w:cs="Calibri" w:eastAsia="Calibri" w:hAnsi="Calibri"/>
         </w:rPr>
-        <w:t xml:space="preserve">6. Decisão solicitada</w:t>
-      </w:r>
-    </w:p>
-    <w:p>
-      <w:pPr>
-        <w:spacing w:after="200" w:before="0"/>
-      </w:pPr>
-      <w:r>
-        <w:rPr>
-          <w:rFonts w:ascii="Calibri" w:cs="Calibri" w:eastAsia="Calibri" w:hAnsi="Calibri"/>
-          <w:sz w:val="22"/>
-          <w:szCs w:val="22"/>
-        </w:rPr>
-        <w:t xml:space="preserve">Submete-se à apreciação do Comandante: (a) o enquadramento dos resultados atuais como descoberta rica (a estratégia ótima depende da escala do alvo), para a versão estendida em periódico; e (b) a autorização para o próximo experimento (multi-fonte com controle de volume), incluindo o uso de GPU associado.</w:t>
+        <w:t xml:space="preserve">6. Próximos passos</w:t>
+      </w:r>
+    </w:p>
+    <w:p>
+      <w:pPr>
+        <w:spacing w:after="80" w:before="0"/>
+      </w:pPr>
+      <w:r>
+        <w:rPr>
+          <w:rFonts w:ascii="Calibri" w:cs="Calibri" w:eastAsia="Calibri" w:hAnsi="Calibri"/>
+          <w:sz w:val="22"/>
+          <w:szCs w:val="22"/>
+        </w:rPr>
+        <w:t xml:space="preserve">Com base nos resultados, os próximos passos definidos são:</w:t>
+      </w:r>
+    </w:p>
+    <w:p>
+      <w:pPr>
+        <w:pStyle w:val="ListParagraph"/>
+        <w:numPr>
+          <w:ilvl w:val="0"/>
+          <w:numId w:val="1"/>
+        </w:numPr>
+        <w:spacing w:after="80"/>
+      </w:pPr>
+      <w:r>
+        <w:rPr>
+          <w:rFonts w:ascii="Calibri" w:cs="Calibri" w:eastAsia="Calibri" w:hAnsi="Calibri"/>
+          <w:b/>
+          <w:bCs/>
+          <w:sz w:val="22"/>
+          <w:szCs w:val="22"/>
+        </w:rPr>
+        <w:t xml:space="preserve">Adotar a síntese in-place (A_joint_ABO) como estratégia de aumento do modelo operacional do CITRA — é a que mais acerta no cenário-alvo real.</w:t>
+      </w:r>
+    </w:p>
+    <w:p>
+      <w:pPr>
+        <w:pStyle w:val="ListParagraph"/>
+        <w:numPr>
+          <w:ilvl w:val="0"/>
+          <w:numId w:val="1"/>
+        </w:numPr>
+        <w:spacing w:after="80"/>
+      </w:pPr>
+      <w:r>
+        <w:rPr>
+          <w:rFonts w:ascii="Calibri" w:cs="Calibri" w:eastAsia="Calibri" w:hAnsi="Calibri"/>
+          <w:sz w:val="22"/>
+          <w:szCs w:val="22"/>
+        </w:rPr>
+        <w:t xml:space="preserve">Executar o experimento multi-fonte com controle de volume (Seção 5) para verificar se um dataset multi-fonte torna o modelo operacional ainda mais assertivo no CITRA.</w:t>
+      </w:r>
+    </w:p>
+    <w:p>
+      <w:pPr>
+        <w:pStyle w:val="ListParagraph"/>
+        <w:numPr>
+          <w:ilvl w:val="0"/>
+          <w:numId w:val="1"/>
+        </w:numPr>
+        <w:spacing w:after="80"/>
+      </w:pPr>
+      <w:r>
+        <w:rPr>
+          <w:rFonts w:ascii="Calibri" w:cs="Calibri" w:eastAsia="Calibri" w:hAnsi="Calibri"/>
+          <w:sz w:val="22"/>
+          <w:szCs w:val="22"/>
+        </w:rPr>
+        <w:t xml:space="preserve">Manter o monitoramento por escala: se o cenário de emprego passar a incluir embarcações maiores/próximas, reavaliar a estratégia (o co-treino real passa a ser competitivo).</w:t>
+      </w:r>
+    </w:p>
+    <w:p>
+      <w:pPr>
+        <w:pStyle w:val="ListParagraph"/>
+        <w:numPr>
+          <w:ilvl w:val="0"/>
+          <w:numId w:val="1"/>
+        </w:numPr>
+        <w:spacing w:after="80"/>
+      </w:pPr>
+      <w:r>
+        <w:rPr>
+          <w:rFonts w:ascii="Calibri" w:cs="Calibri" w:eastAsia="Calibri" w:hAnsi="Calibri"/>
+          <w:sz w:val="22"/>
+          <w:szCs w:val="22"/>
+        </w:rPr>
+        <w:t xml:space="preserve">Consolidar a versão estendida em periódico — formalização do trabalho, subproduto da construção do modelo.</w:t>
+      </w:r>
+    </w:p>
+    <w:p>
+      <w:pPr>
+        <w:spacing w:after="200" w:before="100"/>
+      </w:pPr>
+      <w:r>
+        <w:rPr>
+          <w:rFonts w:ascii="Calibri" w:cs="Calibri" w:eastAsia="Calibri" w:hAnsi="Calibri"/>
+          <w:sz w:val="22"/>
+          <w:szCs w:val="22"/>
+        </w:rPr>
+        <w:t xml:space="preserve">Todo o código, dados de resultado e figuras estão versionados no repositório do projeto: github.com/DanielaLFreire/maritime-crossdomain.</w:t>
       </w:r>
     </w:p>
     <w:p>

</xml_diff>

<commit_message>
Relatorio: distancias completas + plano multi-fonte em 2 fases
</commit_message>
<xml_diff>
--- a/docs/Relatorio_CrossDomain_Marinha.docx
+++ b/docs/Relatorio_CrossDomain_Marinha.docx
@@ -209,7 +209,33 @@
           <w:sz w:val="22"/>
           <w:szCs w:val="22"/>
         </w:rPr>
-        <w:t xml:space="preserve">O artigo usou uma única fonte, distante. A extensão adiciona uma segunda fonte, ABOShips, que é estruturalmente PRÓXIMA do CITRA (distância 0,95, contra a distância muito maior do InaTechShips). Isso permite responder a uma pergunta nova: a estratégia de aumento depende de COMO a fonte é usada — como imagem sintética ou como dado real?</w:t>
+        <w:t xml:space="preserve">O artigo usou uma única fonte, o InaTechShips, estruturalmente distante do CITRA — suas embarcações ocupam ~54% da imagem, contra 0,1% do CITRA (Tabela I do artigo). A extensão adiciona uma segunda fonte, o ABOShips, estruturalmente PRÓXIMA do CITRA (distância medida = 0,95). Isso permite responder a uma pergunta nova: a estratégia de aumento depende de COMO a fonte é usada — como imagem sintética ou como dado real?</w:t>
+      </w:r>
+    </w:p>
+    <w:p>
+      <w:pPr>
+        <w:spacing w:after="80" w:before="0"/>
+      </w:pPr>
+      <w:r>
+        <w:rPr>
+          <w:rFonts w:ascii="Calibri" w:cs="Calibri" w:eastAsia="Calibri" w:hAnsi="Calibri"/>
+          <w:sz w:val="20"/>
+          <w:szCs w:val="20"/>
+        </w:rPr>
+        <w:t xml:space="preserve">Como medimos a "distância estrutural": é um índice que compara dois datasets em três eixos objetivos — (1) escala das embarcações (área mediana das caixas), (2) densidade (embarcações por imagem) e (3) proporção de embarcações pequenas. Cada eixo é normalizado e a distância é a combinação dos três (quanto menor, mais parecidos estruturalmente).</w:t>
+      </w:r>
+    </w:p>
+    <w:p>
+      <w:pPr>
+        <w:spacing w:after="160" w:before="0"/>
+      </w:pPr>
+      <w:r>
+        <w:rPr>
+          <w:rFonts w:ascii="Calibri" w:cs="Calibri" w:eastAsia="Calibri" w:hAnsi="Calibri"/>
+          <w:sz w:val="20"/>
+          <w:szCs w:val="20"/>
+        </w:rPr>
+        <w:t xml:space="preserve">As distâncias medidas dos datasets ao CITRA foram: ABOShips 0,95 (o mais próximo) &lt; SMD 1,84 &lt; SeaShips 4,08. O InaTechShips, medido à parte, é a fonte mais distante de todas — o que o afasta do CITRA são justamente os eixos de escala e proporção de pequenas (suas embarcações são enormes e nenhuma é pequena, contra 82% de pequenas no CITRA). Esse detalhe explica um ponto central: a composição sintética in-place corrige exatamente esses dois eixos (redimensiona as embarcações para a escala pequena do CITRA), e é por isso que o InaTechShips, péssimo quando usado por pré-treino direto (−4,15 pontos), torna-se a melhor fonte quando usado por síntese (+1,00 pontos no artigo). A síntese ataca precisamente onde a fonte é incompatível.</w:t>
       </w:r>
     </w:p>
     <w:p>
@@ -1786,7 +1812,7 @@
         <w:rPr>
           <w:rFonts w:ascii="Calibri" w:cs="Calibri" w:eastAsia="Calibri" w:hAnsi="Calibri"/>
         </w:rPr>
-        <w:t xml:space="preserve">5. Proposta de próximo experimento — síntese multi-fonte com controle de volume</w:t>
+        <w:t xml:space="preserve">5. Próximo experimento — multi-fonte de embarcações, em duas fases</w:t>
       </w:r>
     </w:p>
     <w:p>
@@ -1799,20 +1825,7 @@
           <w:sz w:val="22"/>
           <w:szCs w:val="22"/>
         </w:rPr>
-        <w:t xml:space="preserve">A pergunta que serve diretamente ao modelo operacional: adicionar crops sintéticos de mais de uma fonte torna o modelo do CITRA ainda mais assertivo? Mais variedade de aparência de embarcação — sem sair da escala pequena do CITRA — pode aumentar o acerto na operação real, especialmente em condições que o dataset atual cobre pouco.</w:t>
-      </w:r>
-    </w:p>
-    <w:p>
-      <w:pPr>
-        <w:spacing w:after="120" w:before="0"/>
-      </w:pPr>
-      <w:r>
-        <w:rPr>
-          <w:rFonts w:ascii="Calibri" w:cs="Calibri" w:eastAsia="Calibri" w:hAnsi="Calibri"/>
-          <w:sz w:val="22"/>
-          <w:szCs w:val="22"/>
-        </w:rPr>
-        <w:t xml:space="preserve">A ideia é compor o CITRA com crops sintéticos de DUAS fontes (ABOShips + SMD on-shore), sempre coladas na escala do CITRA, e medir o ganho no PRÓPRIO CITRA (o alvo). O SeaShips entra apenas como sonda-diagnóstico secundária.</w:t>
+        <w:t xml:space="preserve">A pergunta que serve diretamente ao modelo operacional: usar embarcações sintéticas de mais de uma fonte torna o modelo do CITRA mais assertivo? E, antes disso: entre as fontes disponíveis, alguma rende melhor que a outra quando comparadas de forma justa? Dispomos de crops de duas fontes em extremos opostos do eixo estrutural — ABOShips (a mais próxima) e InaTechShips (a mais distante) — o que torna a comparação especialmente informativa. Todas as embarcações são sempre coladas na escala do CITRA (composição in-place), e o ganho é medido no PRÓPRIO CITRA (o alvo operacional).</w:t>
       </w:r>
     </w:p>
     <w:p>
@@ -1827,12 +1840,12 @@
           <w:sz w:val="22"/>
           <w:szCs w:val="22"/>
         </w:rPr>
-        <w:t xml:space="preserve">O cuidado metodológico decisivo — controle de volume:</w:t>
-      </w:r>
-    </w:p>
-    <w:p>
-      <w:pPr>
-        <w:spacing w:after="120" w:before="0"/>
+        <w:t xml:space="preserve">Fase 1 — "a fonte importa?" (volume igual):</w:t>
+      </w:r>
+    </w:p>
+    <w:p>
+      <w:pPr>
+        <w:spacing w:after="100" w:before="0"/>
       </w:pPr>
       <w:r>
         <w:rPr>
@@ -1840,7 +1853,7 @@
           <w:sz w:val="22"/>
           <w:szCs w:val="22"/>
         </w:rPr>
-        <w:t xml:space="preserve">Ao juntar duas fontes, mudam DUAS coisas ao mesmo tempo: a diversidade de fontes e o volume de imagens. Para saber se um eventual ganho vem da diversidade (e não de simplesmente mais dados), incluiremos um braço de controle com o MESMO volume de imagens, porém de fonte única. Sem esse controle, um revisor — e a própria decisão de engenharia — não conseguiria distinguir as duas causas.</w:t>
+        <w:t xml:space="preserve">Compara as duas fontes isoladamente, com o MESMO número de crops (V = o menor volume entre elas; a maior é subamostrada para igualar). Como os dois braços têm volume idêntico, background idêntico e protocolo idêntico, a única variável é a fonte — isolando o efeito dela.</w:t>
       </w:r>
     </w:p>
     <w:tbl>
@@ -1856,8 +1869,8 @@
         </w:tblBorders>
       </w:tblPr>
       <w:tblGrid>
-        <w:gridCol w:w="3200"/>
-        <w:gridCol w:w="3800"/>
+        <w:gridCol w:w="3000"/>
+        <w:gridCol w:w="4000"/>
         <w:gridCol w:w="2000"/>
       </w:tblGrid>
       <w:tr>
@@ -1866,7 +1879,7 @@
         </w:trPr>
         <w:tc>
           <w:tcPr>
-            <w:tcW w:type="dxa" w:w="3200"/>
+            <w:tcW w:type="dxa" w:w="3000"/>
             <w:shd w:fill="2e7d32" w:val="clear"/>
             <w:tcMar>
               <w:top w:type="dxa" w:w="40"/>
@@ -1888,13 +1901,13 @@
                 <w:sz w:val="20"/>
                 <w:szCs w:val="20"/>
               </w:rPr>
-              <w:t xml:space="preserve">Braço proposto</w:t>
-            </w:r>
-          </w:p>
-        </w:tc>
-        <w:tc>
-          <w:tcPr>
-            <w:tcW w:type="dxa" w:w="3800"/>
+              <w:t xml:space="preserve">Braço (Fase 1)</w:t>
+            </w:r>
+          </w:p>
+        </w:tc>
+        <w:tc>
+          <w:tcPr>
+            <w:tcW w:type="dxa" w:w="4000"/>
             <w:shd w:fill="2e7d32" w:val="clear"/>
             <w:tcMar>
               <w:top w:type="dxa" w:w="40"/>
@@ -1952,7 +1965,7 @@
       <w:tr>
         <w:tc>
           <w:tcPr>
-            <w:tcW w:type="dxa" w:w="3200"/>
+            <w:tcW w:type="dxa" w:w="3000"/>
             <w:tcMar>
               <w:top w:type="dxa" w:w="40"/>
               <w:left w:type="dxa" w:w="80"/>
@@ -1972,13 +1985,13 @@
                 <w:sz w:val="20"/>
                 <w:szCs w:val="20"/>
               </w:rPr>
-              <w:t xml:space="preserve">Multi-fonte</w:t>
-            </w:r>
-          </w:p>
-        </w:tc>
-        <w:tc>
-          <w:tcPr>
-            <w:tcW w:type="dxa" w:w="3800"/>
+              <w:t xml:space="preserve">M_ABO</w:t>
+            </w:r>
+          </w:p>
+        </w:tc>
+        <w:tc>
+          <w:tcPr>
+            <w:tcW w:type="dxa" w:w="4000"/>
             <w:tcMar>
               <w:top w:type="dxa" w:w="40"/>
               <w:left w:type="dxa" w:w="80"/>
@@ -1996,31 +2009,31 @@
                 <w:sz w:val="20"/>
                 <w:szCs w:val="20"/>
               </w:rPr>
-              <w:t xml:space="preserve">CITRA + sintético (ABOShips + SMD)</w:t>
-            </w:r>
-          </w:p>
-        </w:tc>
-        <w:tc>
-          <w:tcPr>
-            <w:tcW w:type="dxa" w:w="2000"/>
-            <w:tcMar>
-              <w:top w:type="dxa" w:w="40"/>
-              <w:left w:type="dxa" w:w="80"/>
-              <w:bottom w:type="dxa" w:w="40"/>
-              <w:right w:type="dxa" w:w="80"/>
-            </w:tcMar>
-          </w:tcPr>
-          <w:p>
-            <w:pPr>
-              <w:jc w:val="center"/>
-            </w:pPr>
-            <w:r>
-              <w:rPr>
-                <w:rFonts w:ascii="Calibri" w:cs="Calibri" w:eastAsia="Calibri" w:hAnsi="Calibri"/>
-                <w:sz w:val="20"/>
-                <w:szCs w:val="20"/>
-              </w:rPr>
-              <w:t xml:space="preserve">2V</w:t>
+              <w:t xml:space="preserve">CITRA + crops ABOShips</w:t>
+            </w:r>
+          </w:p>
+        </w:tc>
+        <w:tc>
+          <w:tcPr>
+            <w:tcW w:type="dxa" w:w="2000"/>
+            <w:tcMar>
+              <w:top w:type="dxa" w:w="40"/>
+              <w:left w:type="dxa" w:w="80"/>
+              <w:bottom w:type="dxa" w:w="40"/>
+              <w:right w:type="dxa" w:w="80"/>
+            </w:tcMar>
+          </w:tcPr>
+          <w:p>
+            <w:pPr>
+              <w:jc w:val="center"/>
+            </w:pPr>
+            <w:r>
+              <w:rPr>
+                <w:rFonts w:ascii="Calibri" w:cs="Calibri" w:eastAsia="Calibri" w:hAnsi="Calibri"/>
+                <w:sz w:val="20"/>
+                <w:szCs w:val="20"/>
+              </w:rPr>
+              <w:t xml:space="preserve">V</w:t>
             </w:r>
           </w:p>
         </w:tc>
@@ -2028,8 +2041,7 @@
       <w:tr>
         <w:tc>
           <w:tcPr>
-            <w:tcW w:type="dxa" w:w="3200"/>
-            <w:shd w:fill="eceff1" w:val="clear"/>
+            <w:tcW w:type="dxa" w:w="3000"/>
             <w:tcMar>
               <w:top w:type="dxa" w:w="40"/>
               <w:left w:type="dxa" w:w="80"/>
@@ -2049,14 +2061,13 @@
                 <w:sz w:val="20"/>
                 <w:szCs w:val="20"/>
               </w:rPr>
-              <w:t xml:space="preserve">Controle de volume</w:t>
-            </w:r>
-          </w:p>
-        </w:tc>
-        <w:tc>
-          <w:tcPr>
-            <w:tcW w:type="dxa" w:w="3800"/>
-            <w:shd w:fill="eceff1" w:val="clear"/>
+              <w:t xml:space="preserve">M_InaTech</w:t>
+            </w:r>
+          </w:p>
+        </w:tc>
+        <w:tc>
+          <w:tcPr>
+            <w:tcW w:type="dxa" w:w="4000"/>
             <w:tcMar>
               <w:top w:type="dxa" w:w="40"/>
               <w:left w:type="dxa" w:w="80"/>
@@ -2074,82 +2085,7 @@
                 <w:sz w:val="20"/>
                 <w:szCs w:val="20"/>
               </w:rPr>
-              <w:t xml:space="preserve">CITRA + sintético (só ABOShips, dobrado)</w:t>
-            </w:r>
-          </w:p>
-        </w:tc>
-        <w:tc>
-          <w:tcPr>
-            <w:tcW w:type="dxa" w:w="2000"/>
-            <w:shd w:fill="eceff1" w:val="clear"/>
-            <w:tcMar>
-              <w:top w:type="dxa" w:w="40"/>
-              <w:left w:type="dxa" w:w="80"/>
-              <w:bottom w:type="dxa" w:w="40"/>
-              <w:right w:type="dxa" w:w="80"/>
-            </w:tcMar>
-          </w:tcPr>
-          <w:p>
-            <w:pPr>
-              <w:jc w:val="center"/>
-            </w:pPr>
-            <w:r>
-              <w:rPr>
-                <w:rFonts w:ascii="Calibri" w:cs="Calibri" w:eastAsia="Calibri" w:hAnsi="Calibri"/>
-                <w:sz w:val="20"/>
-                <w:szCs w:val="20"/>
-              </w:rPr>
-              <w:t xml:space="preserve">2V</w:t>
-            </w:r>
-          </w:p>
-        </w:tc>
-      </w:tr>
-      <w:tr>
-        <w:tc>
-          <w:tcPr>
-            <w:tcW w:type="dxa" w:w="3200"/>
-            <w:tcMar>
-              <w:top w:type="dxa" w:w="40"/>
-              <w:left w:type="dxa" w:w="80"/>
-              <w:bottom w:type="dxa" w:w="40"/>
-              <w:right w:type="dxa" w:w="80"/>
-            </w:tcMar>
-          </w:tcPr>
-          <w:p>
-            <w:pPr>
-              <w:jc w:val="left"/>
-            </w:pPr>
-            <w:r>
-              <w:rPr>
-                <w:rFonts w:ascii="Calibri" w:cs="Calibri" w:eastAsia="Calibri" w:hAnsi="Calibri"/>
-                <w:sz w:val="20"/>
-                <w:szCs w:val="20"/>
-              </w:rPr>
-              <w:t xml:space="preserve">Referência</w:t>
-            </w:r>
-          </w:p>
-        </w:tc>
-        <w:tc>
-          <w:tcPr>
-            <w:tcW w:type="dxa" w:w="3800"/>
-            <w:tcMar>
-              <w:top w:type="dxa" w:w="40"/>
-              <w:left w:type="dxa" w:w="80"/>
-              <w:bottom w:type="dxa" w:w="40"/>
-              <w:right w:type="dxa" w:w="80"/>
-            </w:tcMar>
-          </w:tcPr>
-          <w:p>
-            <w:pPr>
-              <w:jc w:val="left"/>
-            </w:pPr>
-            <w:r>
-              <w:rPr>
-                <w:rFonts w:ascii="Calibri" w:cs="Calibri" w:eastAsia="Calibri" w:hAnsi="Calibri"/>
-                <w:sz w:val="20"/>
-                <w:szCs w:val="20"/>
-              </w:rPr>
-              <w:t xml:space="preserve">A_joint_ABO (fonte única, volume simples)</w:t>
+              <w:t xml:space="preserve">CITRA + crops InaTechShips</w:t>
             </w:r>
           </w:p>
         </w:tc>
@@ -2181,7 +2117,7 @@
     </w:tbl>
     <w:p>
       <w:pPr>
-        <w:spacing w:after="120" w:before="0"/>
+        <w:spacing w:after="160" w:before="0"/>
       </w:pPr>
       <w:r>
         <w:rPr>
@@ -2191,7 +2127,7 @@
           <w:sz w:val="20"/>
           <w:szCs w:val="20"/>
         </w:rPr>
-        <w:t xml:space="preserve">Comparando "multi-fonte" com "controle de volume" (ambos com o mesmo volume 2V), isolamos o efeito da diversidade de fontes. Avaliação em CITRA (in-domain) e SeaShips (generalização), mantendo o SeaShips intocado no treino.</w:t>
+        <w:t xml:space="preserve">Resultado esperado: se M_InaTech &gt; M_ABO (com volume igual), a diversidade/qualidade da fonte pesa mais que a proximidade estrutural. Se empatarem, a fonte não importa quando o volume é igual — o que vale é apenas o redimensionamento para a escala do CITRA. Qualquer desfecho é uma conclusão de engenharia útil e limpa.</w:t>
       </w:r>
     </w:p>
     <w:p>
@@ -2206,7 +2142,337 @@
           <w:sz w:val="22"/>
           <w:szCs w:val="22"/>
         </w:rPr>
-        <w:t xml:space="preserve">O que cada resultado nos diria:</w:t>
+        <w:t xml:space="preserve">Fase 2 — "combinar ajuda?" (com controle de volume):</w:t>
+      </w:r>
+    </w:p>
+    <w:p>
+      <w:pPr>
+        <w:spacing w:after="100" w:before="0"/>
+      </w:pPr>
+      <w:r>
+        <w:rPr>
+          <w:rFonts w:ascii="Calibri" w:cs="Calibri" w:eastAsia="Calibri" w:hAnsi="Calibri"/>
+          <w:sz w:val="22"/>
+          <w:szCs w:val="22"/>
+        </w:rPr>
+        <w:t xml:space="preserve">Só se a Fase 1 justificar. Ao juntar duas fontes, mudam DUAS coisas: a diversidade de fontes e o volume. Para saber se um ganho vem da diversidade (e não de simplesmente mais dados), o braço de combinação é comparado a um controle de MESMO volume, porém de fonte única.</w:t>
+      </w:r>
+    </w:p>
+    <w:tbl>
+      <w:tblPr>
+        <w:tblW w:type="dxa" w:w="9000"/>
+        <w:tblBorders>
+          <w:top w:val="single" w:color="auto" w:sz="4"/>
+          <w:left w:val="single" w:color="auto" w:sz="4"/>
+          <w:bottom w:val="single" w:color="auto" w:sz="4"/>
+          <w:right w:val="single" w:color="auto" w:sz="4"/>
+          <w:insideH w:val="single" w:color="auto" w:sz="4"/>
+          <w:insideV w:val="single" w:color="auto" w:sz="4"/>
+        </w:tblBorders>
+      </w:tblPr>
+      <w:tblGrid>
+        <w:gridCol w:w="3000"/>
+        <w:gridCol w:w="4000"/>
+        <w:gridCol w:w="2000"/>
+      </w:tblGrid>
+      <w:tr>
+        <w:trPr>
+          <w:tblHeader/>
+        </w:trPr>
+        <w:tc>
+          <w:tcPr>
+            <w:tcW w:type="dxa" w:w="3000"/>
+            <w:shd w:fill="1565c0" w:val="clear"/>
+            <w:tcMar>
+              <w:top w:type="dxa" w:w="40"/>
+              <w:left w:type="dxa" w:w="80"/>
+              <w:bottom w:type="dxa" w:w="40"/>
+              <w:right w:type="dxa" w:w="80"/>
+            </w:tcMar>
+          </w:tcPr>
+          <w:p>
+            <w:pPr>
+              <w:jc w:val="left"/>
+            </w:pPr>
+            <w:r>
+              <w:rPr>
+                <w:rFonts w:ascii="Calibri" w:cs="Calibri" w:eastAsia="Calibri" w:hAnsi="Calibri"/>
+                <w:b/>
+                <w:bCs/>
+                <w:color w:val="FFFFFF"/>
+                <w:sz w:val="20"/>
+                <w:szCs w:val="20"/>
+              </w:rPr>
+              <w:t xml:space="preserve">Braço (Fase 2)</w:t>
+            </w:r>
+          </w:p>
+        </w:tc>
+        <w:tc>
+          <w:tcPr>
+            <w:tcW w:type="dxa" w:w="4000"/>
+            <w:shd w:fill="1565c0" w:val="clear"/>
+            <w:tcMar>
+              <w:top w:type="dxa" w:w="40"/>
+              <w:left w:type="dxa" w:w="80"/>
+              <w:bottom w:type="dxa" w:w="40"/>
+              <w:right w:type="dxa" w:w="80"/>
+            </w:tcMar>
+          </w:tcPr>
+          <w:p>
+            <w:pPr>
+              <w:jc w:val="left"/>
+            </w:pPr>
+            <w:r>
+              <w:rPr>
+                <w:rFonts w:ascii="Calibri" w:cs="Calibri" w:eastAsia="Calibri" w:hAnsi="Calibri"/>
+                <w:b/>
+                <w:bCs/>
+                <w:color w:val="FFFFFF"/>
+                <w:sz w:val="20"/>
+                <w:szCs w:val="20"/>
+              </w:rPr>
+              <w:t xml:space="preserve">Composição</w:t>
+            </w:r>
+          </w:p>
+        </w:tc>
+        <w:tc>
+          <w:tcPr>
+            <w:tcW w:type="dxa" w:w="2000"/>
+            <w:shd w:fill="1565c0" w:val="clear"/>
+            <w:tcMar>
+              <w:top w:type="dxa" w:w="40"/>
+              <w:left w:type="dxa" w:w="80"/>
+              <w:bottom w:type="dxa" w:w="40"/>
+              <w:right w:type="dxa" w:w="80"/>
+            </w:tcMar>
+          </w:tcPr>
+          <w:p>
+            <w:pPr>
+              <w:jc w:val="center"/>
+            </w:pPr>
+            <w:r>
+              <w:rPr>
+                <w:rFonts w:ascii="Calibri" w:cs="Calibri" w:eastAsia="Calibri" w:hAnsi="Calibri"/>
+                <w:b/>
+                <w:bCs/>
+                <w:color w:val="FFFFFF"/>
+                <w:sz w:val="20"/>
+                <w:szCs w:val="20"/>
+              </w:rPr>
+              <w:t xml:space="preserve">Volume</w:t>
+            </w:r>
+          </w:p>
+        </w:tc>
+      </w:tr>
+      <w:tr>
+        <w:tc>
+          <w:tcPr>
+            <w:tcW w:type="dxa" w:w="3000"/>
+            <w:tcMar>
+              <w:top w:type="dxa" w:w="40"/>
+              <w:left w:type="dxa" w:w="80"/>
+              <w:bottom w:type="dxa" w:w="40"/>
+              <w:right w:type="dxa" w:w="80"/>
+            </w:tcMar>
+          </w:tcPr>
+          <w:p>
+            <w:pPr>
+              <w:jc w:val="left"/>
+            </w:pPr>
+            <w:r>
+              <w:rPr>
+                <w:rFonts w:ascii="Calibri" w:cs="Calibri" w:eastAsia="Calibri" w:hAnsi="Calibri"/>
+                <w:b/>
+                <w:bCs/>
+                <w:sz w:val="20"/>
+                <w:szCs w:val="20"/>
+              </w:rPr>
+              <w:t xml:space="preserve">M_both</w:t>
+            </w:r>
+          </w:p>
+        </w:tc>
+        <w:tc>
+          <w:tcPr>
+            <w:tcW w:type="dxa" w:w="4000"/>
+            <w:tcMar>
+              <w:top w:type="dxa" w:w="40"/>
+              <w:left w:type="dxa" w:w="80"/>
+              <w:bottom w:type="dxa" w:w="40"/>
+              <w:right w:type="dxa" w:w="80"/>
+            </w:tcMar>
+          </w:tcPr>
+          <w:p>
+            <w:pPr>
+              <w:jc w:val="left"/>
+            </w:pPr>
+            <w:r>
+              <w:rPr>
+                <w:rFonts w:ascii="Calibri" w:cs="Calibri" w:eastAsia="Calibri" w:hAnsi="Calibri"/>
+                <w:sz w:val="20"/>
+                <w:szCs w:val="20"/>
+              </w:rPr>
+              <w:t xml:space="preserve">CITRA + InaTech + ABO (V de cada)</w:t>
+            </w:r>
+          </w:p>
+        </w:tc>
+        <w:tc>
+          <w:tcPr>
+            <w:tcW w:type="dxa" w:w="2000"/>
+            <w:tcMar>
+              <w:top w:type="dxa" w:w="40"/>
+              <w:left w:type="dxa" w:w="80"/>
+              <w:bottom w:type="dxa" w:w="40"/>
+              <w:right w:type="dxa" w:w="80"/>
+            </w:tcMar>
+          </w:tcPr>
+          <w:p>
+            <w:pPr>
+              <w:jc w:val="center"/>
+            </w:pPr>
+            <w:r>
+              <w:rPr>
+                <w:rFonts w:ascii="Calibri" w:cs="Calibri" w:eastAsia="Calibri" w:hAnsi="Calibri"/>
+                <w:sz w:val="20"/>
+                <w:szCs w:val="20"/>
+              </w:rPr>
+              <w:t xml:space="preserve">2V</w:t>
+            </w:r>
+          </w:p>
+        </w:tc>
+      </w:tr>
+      <w:tr>
+        <w:tc>
+          <w:tcPr>
+            <w:tcW w:type="dxa" w:w="3000"/>
+            <w:shd w:fill="eceff1" w:val="clear"/>
+            <w:tcMar>
+              <w:top w:type="dxa" w:w="40"/>
+              <w:left w:type="dxa" w:w="80"/>
+              <w:bottom w:type="dxa" w:w="40"/>
+              <w:right w:type="dxa" w:w="80"/>
+            </w:tcMar>
+          </w:tcPr>
+          <w:p>
+            <w:pPr>
+              <w:jc w:val="left"/>
+            </w:pPr>
+            <w:r>
+              <w:rPr>
+                <w:rFonts w:ascii="Calibri" w:cs="Calibri" w:eastAsia="Calibri" w:hAnsi="Calibri"/>
+                <w:b/>
+                <w:bCs/>
+                <w:sz w:val="20"/>
+                <w:szCs w:val="20"/>
+              </w:rPr>
+              <w:t xml:space="preserve">M_control</w:t>
+            </w:r>
+          </w:p>
+        </w:tc>
+        <w:tc>
+          <w:tcPr>
+            <w:tcW w:type="dxa" w:w="4000"/>
+            <w:shd w:fill="eceff1" w:val="clear"/>
+            <w:tcMar>
+              <w:top w:type="dxa" w:w="40"/>
+              <w:left w:type="dxa" w:w="80"/>
+              <w:bottom w:type="dxa" w:w="40"/>
+              <w:right w:type="dxa" w:w="80"/>
+            </w:tcMar>
+          </w:tcPr>
+          <w:p>
+            <w:pPr>
+              <w:jc w:val="left"/>
+            </w:pPr>
+            <w:r>
+              <w:rPr>
+                <w:rFonts w:ascii="Calibri" w:cs="Calibri" w:eastAsia="Calibri" w:hAnsi="Calibri"/>
+                <w:sz w:val="20"/>
+                <w:szCs w:val="20"/>
+              </w:rPr>
+              <w:t xml:space="preserve">CITRA + a melhor fonte da Fase 1, dobrada</w:t>
+            </w:r>
+          </w:p>
+        </w:tc>
+        <w:tc>
+          <w:tcPr>
+            <w:tcW w:type="dxa" w:w="2000"/>
+            <w:shd w:fill="eceff1" w:val="clear"/>
+            <w:tcMar>
+              <w:top w:type="dxa" w:w="40"/>
+              <w:left w:type="dxa" w:w="80"/>
+              <w:bottom w:type="dxa" w:w="40"/>
+              <w:right w:type="dxa" w:w="80"/>
+            </w:tcMar>
+          </w:tcPr>
+          <w:p>
+            <w:pPr>
+              <w:jc w:val="center"/>
+            </w:pPr>
+            <w:r>
+              <w:rPr>
+                <w:rFonts w:ascii="Calibri" w:cs="Calibri" w:eastAsia="Calibri" w:hAnsi="Calibri"/>
+                <w:sz w:val="20"/>
+                <w:szCs w:val="20"/>
+              </w:rPr>
+              <w:t xml:space="preserve">2V</w:t>
+            </w:r>
+          </w:p>
+        </w:tc>
+      </w:tr>
+    </w:tbl>
+    <w:p>
+      <w:pPr>
+        <w:spacing w:after="160" w:before="0"/>
+      </w:pPr>
+      <w:r>
+        <w:rPr>
+          <w:rFonts w:ascii="Calibri" w:cs="Calibri" w:eastAsia="Calibri" w:hAnsi="Calibri"/>
+          <w:i/>
+          <w:iCs/>
+          <w:sz w:val="20"/>
+          <w:szCs w:val="20"/>
+        </w:rPr>
+        <w:t xml:space="preserve">Comparando M_both com M_control (ambos com volume 2V), isola-se o efeito da diversidade de fontes: se M_both &gt; M_control, combinar fontes ajuda de fato; se empatarem, o ganho vinha do volume, e basta escalar a melhor fonte única (mais simples de manter em produção).</w:t>
+      </w:r>
+    </w:p>
+    <w:p>
+      <w:pPr>
+        <w:spacing w:after="120" w:before="120"/>
+      </w:pPr>
+      <w:r>
+        <w:rPr>
+          <w:rFonts w:ascii="Calibri" w:cs="Calibri" w:eastAsia="Calibri" w:hAnsi="Calibri"/>
+          <w:i/>
+          <w:iCs/>
+          <w:sz w:val="20"/>
+          <w:szCs w:val="20"/>
+        </w:rPr>
+        <w:t xml:space="preserve">Custo estimado: Fase 1 acrescenta 1 braço novo (M_InaTech; o M_ABO já foi treinado) × 3 repetições; a Fase 2 acrescenta mais 2 braços × 3 repetições, apenas se justificada. Toda a infraestrutura de composição e treino já está construída. O foco é a decisão de engenharia: qual composição de dataset produz o modelo operacional mais assertivo no CITRA — as publicações são a formalização desse trabalho.</w:t>
+      </w:r>
+    </w:p>
+    <w:p>
+      <w:pPr>
+        <w:pStyle w:val="Heading1"/>
+        <w:spacing w:after="120" w:before="240"/>
+      </w:pPr>
+      <w:r>
+        <w:rPr>
+          <w:rFonts w:ascii="Calibri" w:cs="Calibri" w:eastAsia="Calibri" w:hAnsi="Calibri"/>
+        </w:rPr>
+        <w:t xml:space="preserve">6. Próximos passos</w:t>
+      </w:r>
+    </w:p>
+    <w:p>
+      <w:pPr>
+        <w:spacing w:after="80" w:before="0"/>
+      </w:pPr>
+      <w:r>
+        <w:rPr>
+          <w:rFonts w:ascii="Calibri" w:cs="Calibri" w:eastAsia="Calibri" w:hAnsi="Calibri"/>
+          <w:sz w:val="22"/>
+          <w:szCs w:val="22"/>
+        </w:rPr>
+        <w:t xml:space="preserve">Com base nos resultados, os próximos passos definidos são:</w:t>
       </w:r>
     </w:p>
     <w:p>
@@ -2221,10 +2487,12 @@
       <w:r>
         <w:rPr>
           <w:rFonts w:ascii="Calibri" w:cs="Calibri" w:eastAsia="Calibri" w:hAnsi="Calibri"/>
+          <w:b/>
+          <w:bCs/>
           <w:sz w:val="22"/>
           <w:szCs w:val="22"/>
         </w:rPr>
-        <w:t xml:space="preserve">Se multi-fonte &gt; controle no CITRA: adotar composição multi-fonte no pipeline operacional — modelo mais assertivo na operação real.</w:t>
+        <w:t xml:space="preserve">Adotar a síntese in-place (A_joint_ABO) como estratégia de aumento do modelo operacional do CITRA — é a que mais acerta no cenário-alvo real.</w:t>
       </w:r>
     </w:p>
     <w:p>
@@ -2242,7 +2510,7 @@
           <w:sz w:val="22"/>
           <w:szCs w:val="22"/>
         </w:rPr>
-        <w:t xml:space="preserve">Se forem equivalentes: o ganho vinha do volume, não da diversidade — basta escalar uma fonte, mais simples de manter em produção.</w:t>
+        <w:t xml:space="preserve">Executar a Fase 1 do experimento multi-fonte (Seção 5): treinar M_InaTech no mesmo volume do M_ABO e responder se a fonte importa quando o volume é igualado.</w:t>
       </w:r>
     </w:p>
     <w:p>
@@ -2260,85 +2528,7 @@
           <w:sz w:val="22"/>
           <w:szCs w:val="22"/>
         </w:rPr>
-        <w:t xml:space="preserve">Em qualquer caso, a decisão é sobre COMO montar o dataset de treino do modelo em produção — não um exercício acadêmico.</w:t>
-      </w:r>
-    </w:p>
-    <w:p>
-      <w:pPr>
-        <w:spacing w:after="120" w:before="120"/>
-      </w:pPr>
-      <w:r>
-        <w:rPr>
-          <w:rFonts w:ascii="Calibri" w:cs="Calibri" w:eastAsia="Calibri" w:hAnsi="Calibri"/>
-          <w:i/>
-          <w:iCs/>
-          <w:sz w:val="20"/>
-          <w:szCs w:val="20"/>
-        </w:rPr>
-        <w:t xml:space="preserve">Custo estimado: 3 braços × 3 repetições em GPU (A100), reaproveitando toda a infraestrutura já construída. O foco é a decisão de engenharia: qual composição de dataset produz o modelo operacional mais assertivo no CITRA.</w:t>
-      </w:r>
-    </w:p>
-    <w:p>
-      <w:pPr>
-        <w:pStyle w:val="Heading1"/>
-        <w:spacing w:after="120" w:before="240"/>
-      </w:pPr>
-      <w:r>
-        <w:rPr>
-          <w:rFonts w:ascii="Calibri" w:cs="Calibri" w:eastAsia="Calibri" w:hAnsi="Calibri"/>
-        </w:rPr>
-        <w:t xml:space="preserve">6. Próximos passos</w:t>
-      </w:r>
-    </w:p>
-    <w:p>
-      <w:pPr>
-        <w:spacing w:after="80" w:before="0"/>
-      </w:pPr>
-      <w:r>
-        <w:rPr>
-          <w:rFonts w:ascii="Calibri" w:cs="Calibri" w:eastAsia="Calibri" w:hAnsi="Calibri"/>
-          <w:sz w:val="22"/>
-          <w:szCs w:val="22"/>
-        </w:rPr>
-        <w:t xml:space="preserve">Com base nos resultados, os próximos passos definidos são:</w:t>
-      </w:r>
-    </w:p>
-    <w:p>
-      <w:pPr>
-        <w:pStyle w:val="ListParagraph"/>
-        <w:numPr>
-          <w:ilvl w:val="0"/>
-          <w:numId w:val="1"/>
-        </w:numPr>
-        <w:spacing w:after="80"/>
-      </w:pPr>
-      <w:r>
-        <w:rPr>
-          <w:rFonts w:ascii="Calibri" w:cs="Calibri" w:eastAsia="Calibri" w:hAnsi="Calibri"/>
-          <w:b/>
-          <w:bCs/>
-          <w:sz w:val="22"/>
-          <w:szCs w:val="22"/>
-        </w:rPr>
-        <w:t xml:space="preserve">Adotar a síntese in-place (A_joint_ABO) como estratégia de aumento do modelo operacional do CITRA — é a que mais acerta no cenário-alvo real.</w:t>
-      </w:r>
-    </w:p>
-    <w:p>
-      <w:pPr>
-        <w:pStyle w:val="ListParagraph"/>
-        <w:numPr>
-          <w:ilvl w:val="0"/>
-          <w:numId w:val="1"/>
-        </w:numPr>
-        <w:spacing w:after="80"/>
-      </w:pPr>
-      <w:r>
-        <w:rPr>
-          <w:rFonts w:ascii="Calibri" w:cs="Calibri" w:eastAsia="Calibri" w:hAnsi="Calibri"/>
-          <w:sz w:val="22"/>
-          <w:szCs w:val="22"/>
-        </w:rPr>
-        <w:t xml:space="preserve">Executar o experimento multi-fonte com controle de volume (Seção 5) para verificar se um dataset multi-fonte torna o modelo operacional ainda mais assertivo no CITRA.</w:t>
+        <w:t xml:space="preserve">Conforme o resultado da Fase 1, executar a Fase 2 (combinar fontes com controle de volume) para decidir se um dataset multi-fonte torna o modelo do CITRA ainda mais assertivo.</w:t>
       </w:r>
     </w:p>
     <w:p>

</xml_diff>

<commit_message>
Relatorio: recomendacao separa metodo (comprovado) de fonte (a determinar)
</commit_message>
<xml_diff>
--- a/docs/Relatorio_CrossDomain_Marinha.docx
+++ b/docs/Relatorio_CrossDomain_Marinha.docx
@@ -1759,7 +1759,7 @@
                 <w:sz w:val="22"/>
                 <w:szCs w:val="22"/>
               </w:rPr>
-              <w:t xml:space="preserve">Recomendação para o modelo operacional do CITRA: usar a síntese in-place (A_joint_ABO).</w:t>
+              <w:t xml:space="preserve">Recomendação para o modelo operacional do CITRA: usar a composição sintética in-place como estratégia de aumento.</w:t>
             </w:r>
           </w:p>
           <w:p>
@@ -1772,7 +1772,20 @@
                 <w:sz w:val="21"/>
                 <w:szCs w:val="21"/>
               </w:rPr>
-              <w:t xml:space="preserve">O CITRA é dominado por embarcações pequenas — exatamente o regime em que a síntese vence. Como o alvo real de emprego é o CITRA, a síntese é a escolha certa para o modelo em produção. É também a que entrega o maior recall no CITRA (detecta mais embarcações, o que mais importa em vigilância).</w:t>
+              <w:t xml:space="preserve">O que está comprovado é o MÉTODO: a síntese in-place vence no CITRA, que é dominado por embarcações pequenas — exatamente o regime onde ela é superior. Como o alvo real de emprego é o CITRA, a síntese é a escolha certa para o modelo em produção, e é também a que entrega o maior recall (detecta mais embarcações, o que mais importa em vigilância).</w:t>
+            </w:r>
+          </w:p>
+          <w:p>
+            <w:pPr>
+              <w:spacing w:after="60"/>
+            </w:pPr>
+            <w:r>
+              <w:rPr>
+                <w:rFonts w:ascii="Calibri" w:cs="Calibri" w:eastAsia="Calibri" w:hAnsi="Calibri"/>
+                <w:sz w:val="21"/>
+                <w:szCs w:val="21"/>
+              </w:rPr>
+              <w:t xml:space="preserve">Qual FONTE de embarcações usar na síntese (ABOShips, InaTechShips ou uma combinação) ainda está sendo determinado: os resultados atuais sugerem que a fonte pode afetar o ganho, mas as comparações disponíveis têm volumes diferentes. A Fase 1 do próximo experimento (Seção 5) resolve isso, comparando as fontes com volume igual. Até lá, o braço validado em produção é o A_joint_ABO (ABOShips).</w:t>
             </w:r>
           </w:p>
           <w:p>

</xml_diff>

<commit_message>
Relatorio: tabela e figura de perfil dos 5 datasets na Secao 3
</commit_message>
<xml_diff>
--- a/docs/Relatorio_CrossDomain_Marinha.docx
+++ b/docs/Relatorio_CrossDomain_Marinha.docx
@@ -1578,7 +1578,816 @@
           <w:sz w:val="22"/>
           <w:szCs w:val="22"/>
         </w:rPr>
-        <w:t xml:space="preserve">A explicação está no tamanho das embarcações de cada domínio. Medimos a área das caixas de anotação:</w:t>
+        <w:t xml:space="preserve">A explicação está no tamanho das embarcações de cada domínio. Medimos a área das caixas de anotação de todos os datasets, na mesma resolução (640×640) para comparação justa:</w:t>
+      </w:r>
+    </w:p>
+    <w:tbl>
+      <w:tblPr>
+        <w:tblW w:type="dxa" w:w="9000"/>
+        <w:tblBorders>
+          <w:top w:val="single" w:color="auto" w:sz="4"/>
+          <w:left w:val="single" w:color="auto" w:sz="4"/>
+          <w:bottom w:val="single" w:color="auto" w:sz="4"/>
+          <w:right w:val="single" w:color="auto" w:sz="4"/>
+          <w:insideH w:val="single" w:color="auto" w:sz="4"/>
+          <w:insideV w:val="single" w:color="auto" w:sz="4"/>
+        </w:tblBorders>
+      </w:tblPr>
+      <w:tblGrid>
+        <w:gridCol w:w="2600"/>
+        <w:gridCol w:w="2100"/>
+        <w:gridCol w:w="1400"/>
+        <w:gridCol w:w="1400"/>
+        <w:gridCol w:w="1500"/>
+      </w:tblGrid>
+      <w:tr>
+        <w:trPr>
+          <w:tblHeader/>
+        </w:trPr>
+        <w:tc>
+          <w:tcPr>
+            <w:tcW w:type="dxa" w:w="2600"/>
+            <w:shd w:fill="1565c0" w:val="clear"/>
+            <w:tcMar>
+              <w:top w:type="dxa" w:w="40"/>
+              <w:left w:type="dxa" w:w="80"/>
+              <w:bottom w:type="dxa" w:w="40"/>
+              <w:right w:type="dxa" w:w="80"/>
+            </w:tcMar>
+          </w:tcPr>
+          <w:p>
+            <w:pPr>
+              <w:jc w:val="left"/>
+            </w:pPr>
+            <w:r>
+              <w:rPr>
+                <w:rFonts w:ascii="Calibri" w:cs="Calibri" w:eastAsia="Calibri" w:hAnsi="Calibri"/>
+                <w:b/>
+                <w:bCs/>
+                <w:color w:val="FFFFFF"/>
+                <w:sz w:val="20"/>
+                <w:szCs w:val="20"/>
+              </w:rPr>
+              <w:t xml:space="preserve">Dataset</w:t>
+            </w:r>
+          </w:p>
+        </w:tc>
+        <w:tc>
+          <w:tcPr>
+            <w:tcW w:type="dxa" w:w="2100"/>
+            <w:shd w:fill="1565c0" w:val="clear"/>
+            <w:tcMar>
+              <w:top w:type="dxa" w:w="40"/>
+              <w:left w:type="dxa" w:w="80"/>
+              <w:bottom w:type="dxa" w:w="40"/>
+              <w:right w:type="dxa" w:w="80"/>
+            </w:tcMar>
+          </w:tcPr>
+          <w:p>
+            <w:pPr>
+              <w:jc w:val="center"/>
+            </w:pPr>
+            <w:r>
+              <w:rPr>
+                <w:rFonts w:ascii="Calibri" w:cs="Calibri" w:eastAsia="Calibri" w:hAnsi="Calibri"/>
+                <w:b/>
+                <w:bCs/>
+                <w:color w:val="FFFFFF"/>
+                <w:sz w:val="20"/>
+                <w:szCs w:val="20"/>
+              </w:rPr>
+              <w:t xml:space="preserve">Área mediana</w:t>
+            </w:r>
+          </w:p>
+        </w:tc>
+        <w:tc>
+          <w:tcPr>
+            <w:tcW w:type="dxa" w:w="1400"/>
+            <w:shd w:fill="1565c0" w:val="clear"/>
+            <w:tcMar>
+              <w:top w:type="dxa" w:w="40"/>
+              <w:left w:type="dxa" w:w="80"/>
+              <w:bottom w:type="dxa" w:w="40"/>
+              <w:right w:type="dxa" w:w="80"/>
+            </w:tcMar>
+          </w:tcPr>
+          <w:p>
+            <w:pPr>
+              <w:jc w:val="center"/>
+            </w:pPr>
+            <w:r>
+              <w:rPr>
+                <w:rFonts w:ascii="Calibri" w:cs="Calibri" w:eastAsia="Calibri" w:hAnsi="Calibri"/>
+                <w:b/>
+                <w:bCs/>
+                <w:color w:val="FFFFFF"/>
+                <w:sz w:val="20"/>
+                <w:szCs w:val="20"/>
+              </w:rPr>
+              <w:t xml:space="preserve">% pequenas</w:t>
+            </w:r>
+          </w:p>
+        </w:tc>
+        <w:tc>
+          <w:tcPr>
+            <w:tcW w:type="dxa" w:w="1400"/>
+            <w:shd w:fill="1565c0" w:val="clear"/>
+            <w:tcMar>
+              <w:top w:type="dxa" w:w="40"/>
+              <w:left w:type="dxa" w:w="80"/>
+              <w:bottom w:type="dxa" w:w="40"/>
+              <w:right w:type="dxa" w:w="80"/>
+            </w:tcMar>
+          </w:tcPr>
+          <w:p>
+            <w:pPr>
+              <w:jc w:val="center"/>
+            </w:pPr>
+            <w:r>
+              <w:rPr>
+                <w:rFonts w:ascii="Calibri" w:cs="Calibri" w:eastAsia="Calibri" w:hAnsi="Calibri"/>
+                <w:b/>
+                <w:bCs/>
+                <w:color w:val="FFFFFF"/>
+                <w:sz w:val="20"/>
+                <w:szCs w:val="20"/>
+              </w:rPr>
+              <w:t xml:space="preserve">% grandes</w:t>
+            </w:r>
+          </w:p>
+        </w:tc>
+        <w:tc>
+          <w:tcPr>
+            <w:tcW w:type="dxa" w:w="1500"/>
+            <w:shd w:fill="1565c0" w:val="clear"/>
+            <w:tcMar>
+              <w:top w:type="dxa" w:w="40"/>
+              <w:left w:type="dxa" w:w="80"/>
+              <w:bottom w:type="dxa" w:w="40"/>
+              <w:right w:type="dxa" w:w="80"/>
+            </w:tcMar>
+          </w:tcPr>
+          <w:p>
+            <w:pPr>
+              <w:jc w:val="center"/>
+            </w:pPr>
+            <w:r>
+              <w:rPr>
+                <w:rFonts w:ascii="Calibri" w:cs="Calibri" w:eastAsia="Calibri" w:hAnsi="Calibri"/>
+                <w:b/>
+                <w:bCs/>
+                <w:color w:val="FFFFFF"/>
+                <w:sz w:val="20"/>
+                <w:szCs w:val="20"/>
+              </w:rPr>
+              <w:t xml:space="preserve">obj/imagem</w:t>
+            </w:r>
+          </w:p>
+        </w:tc>
+      </w:tr>
+      <w:tr>
+        <w:tc>
+          <w:tcPr>
+            <w:tcW w:type="dxa" w:w="2600"/>
+            <w:shd w:fill="e8f5e9" w:val="clear"/>
+            <w:tcMar>
+              <w:top w:type="dxa" w:w="40"/>
+              <w:left w:type="dxa" w:w="80"/>
+              <w:bottom w:type="dxa" w:w="40"/>
+              <w:right w:type="dxa" w:w="80"/>
+            </w:tcMar>
+          </w:tcPr>
+          <w:p>
+            <w:pPr>
+              <w:jc w:val="left"/>
+            </w:pPr>
+            <w:r>
+              <w:rPr>
+                <w:rFonts w:ascii="Calibri" w:cs="Calibri" w:eastAsia="Calibri" w:hAnsi="Calibri"/>
+                <w:b/>
+                <w:bCs/>
+                <w:sz w:val="20"/>
+                <w:szCs w:val="20"/>
+              </w:rPr>
+              <w:t xml:space="preserve">CITRA-3D (alvo)</w:t>
+            </w:r>
+          </w:p>
+        </w:tc>
+        <w:tc>
+          <w:tcPr>
+            <w:tcW w:type="dxa" w:w="2100"/>
+            <w:shd w:fill="e8f5e9" w:val="clear"/>
+            <w:tcMar>
+              <w:top w:type="dxa" w:w="40"/>
+              <w:left w:type="dxa" w:w="80"/>
+              <w:bottom w:type="dxa" w:w="40"/>
+              <w:right w:type="dxa" w:w="80"/>
+            </w:tcMar>
+          </w:tcPr>
+          <w:p>
+            <w:pPr>
+              <w:jc w:val="center"/>
+            </w:pPr>
+            <w:r>
+              <w:rPr>
+                <w:rFonts w:ascii="Calibri" w:cs="Calibri" w:eastAsia="Calibri" w:hAnsi="Calibri"/>
+                <w:sz w:val="20"/>
+                <w:szCs w:val="20"/>
+              </w:rPr>
+              <w:t xml:space="preserve">0,10%</w:t>
+            </w:r>
+          </w:p>
+        </w:tc>
+        <w:tc>
+          <w:tcPr>
+            <w:tcW w:type="dxa" w:w="1400"/>
+            <w:shd w:fill="e8f5e9" w:val="clear"/>
+            <w:tcMar>
+              <w:top w:type="dxa" w:w="40"/>
+              <w:left w:type="dxa" w:w="80"/>
+              <w:bottom w:type="dxa" w:w="40"/>
+              <w:right w:type="dxa" w:w="80"/>
+            </w:tcMar>
+          </w:tcPr>
+          <w:p>
+            <w:pPr>
+              <w:jc w:val="center"/>
+            </w:pPr>
+            <w:r>
+              <w:rPr>
+                <w:rFonts w:ascii="Calibri" w:cs="Calibri" w:eastAsia="Calibri" w:hAnsi="Calibri"/>
+                <w:b/>
+                <w:bCs/>
+                <w:sz w:val="20"/>
+                <w:szCs w:val="20"/>
+              </w:rPr>
+              <w:t xml:space="preserve">71,6%</w:t>
+            </w:r>
+          </w:p>
+        </w:tc>
+        <w:tc>
+          <w:tcPr>
+            <w:tcW w:type="dxa" w:w="1400"/>
+            <w:shd w:fill="e8f5e9" w:val="clear"/>
+            <w:tcMar>
+              <w:top w:type="dxa" w:w="40"/>
+              <w:left w:type="dxa" w:w="80"/>
+              <w:bottom w:type="dxa" w:w="40"/>
+              <w:right w:type="dxa" w:w="80"/>
+            </w:tcMar>
+          </w:tcPr>
+          <w:p>
+            <w:pPr>
+              <w:jc w:val="center"/>
+            </w:pPr>
+            <w:r>
+              <w:rPr>
+                <w:rFonts w:ascii="Calibri" w:cs="Calibri" w:eastAsia="Calibri" w:hAnsi="Calibri"/>
+                <w:sz w:val="20"/>
+                <w:szCs w:val="20"/>
+              </w:rPr>
+              <w:t xml:space="preserve">2,9%</w:t>
+            </w:r>
+          </w:p>
+        </w:tc>
+        <w:tc>
+          <w:tcPr>
+            <w:tcW w:type="dxa" w:w="1500"/>
+            <w:shd w:fill="e8f5e9" w:val="clear"/>
+            <w:tcMar>
+              <w:top w:type="dxa" w:w="40"/>
+              <w:left w:type="dxa" w:w="80"/>
+              <w:bottom w:type="dxa" w:w="40"/>
+              <w:right w:type="dxa" w:w="80"/>
+            </w:tcMar>
+          </w:tcPr>
+          <w:p>
+            <w:pPr>
+              <w:jc w:val="center"/>
+            </w:pPr>
+            <w:r>
+              <w:rPr>
+                <w:rFonts w:ascii="Calibri" w:cs="Calibri" w:eastAsia="Calibri" w:hAnsi="Calibri"/>
+                <w:sz w:val="20"/>
+                <w:szCs w:val="20"/>
+              </w:rPr>
+              <w:t xml:space="preserve">3,37</w:t>
+            </w:r>
+          </w:p>
+        </w:tc>
+      </w:tr>
+      <w:tr>
+        <w:tc>
+          <w:tcPr>
+            <w:tcW w:type="dxa" w:w="2600"/>
+            <w:tcMar>
+              <w:top w:type="dxa" w:w="40"/>
+              <w:left w:type="dxa" w:w="80"/>
+              <w:bottom w:type="dxa" w:w="40"/>
+              <w:right w:type="dxa" w:w="80"/>
+            </w:tcMar>
+          </w:tcPr>
+          <w:p>
+            <w:pPr>
+              <w:jc w:val="left"/>
+            </w:pPr>
+            <w:r>
+              <w:rPr>
+                <w:rFonts w:ascii="Calibri" w:cs="Calibri" w:eastAsia="Calibri" w:hAnsi="Calibri"/>
+                <w:sz w:val="20"/>
+                <w:szCs w:val="20"/>
+              </w:rPr>
+              <w:t xml:space="preserve">ABOShips</w:t>
+            </w:r>
+          </w:p>
+        </w:tc>
+        <w:tc>
+          <w:tcPr>
+            <w:tcW w:type="dxa" w:w="2100"/>
+            <w:tcMar>
+              <w:top w:type="dxa" w:w="40"/>
+              <w:left w:type="dxa" w:w="80"/>
+              <w:bottom w:type="dxa" w:w="40"/>
+              <w:right w:type="dxa" w:w="80"/>
+            </w:tcMar>
+          </w:tcPr>
+          <w:p>
+            <w:pPr>
+              <w:jc w:val="center"/>
+            </w:pPr>
+            <w:r>
+              <w:rPr>
+                <w:rFonts w:ascii="Calibri" w:cs="Calibri" w:eastAsia="Calibri" w:hAnsi="Calibri"/>
+                <w:sz w:val="20"/>
+                <w:szCs w:val="20"/>
+              </w:rPr>
+              <w:t xml:space="preserve">0,23%</w:t>
+            </w:r>
+          </w:p>
+        </w:tc>
+        <w:tc>
+          <w:tcPr>
+            <w:tcW w:type="dxa" w:w="1400"/>
+            <w:tcMar>
+              <w:top w:type="dxa" w:w="40"/>
+              <w:left w:type="dxa" w:w="80"/>
+              <w:bottom w:type="dxa" w:w="40"/>
+              <w:right w:type="dxa" w:w="80"/>
+            </w:tcMar>
+          </w:tcPr>
+          <w:p>
+            <w:pPr>
+              <w:jc w:val="center"/>
+            </w:pPr>
+            <w:r>
+              <w:rPr>
+                <w:rFonts w:ascii="Calibri" w:cs="Calibri" w:eastAsia="Calibri" w:hAnsi="Calibri"/>
+                <w:sz w:val="20"/>
+                <w:szCs w:val="20"/>
+              </w:rPr>
+              <w:t xml:space="preserve">52,1%</w:t>
+            </w:r>
+          </w:p>
+        </w:tc>
+        <w:tc>
+          <w:tcPr>
+            <w:tcW w:type="dxa" w:w="1400"/>
+            <w:tcMar>
+              <w:top w:type="dxa" w:w="40"/>
+              <w:left w:type="dxa" w:w="80"/>
+              <w:bottom w:type="dxa" w:w="40"/>
+              <w:right w:type="dxa" w:w="80"/>
+            </w:tcMar>
+          </w:tcPr>
+          <w:p>
+            <w:pPr>
+              <w:jc w:val="center"/>
+            </w:pPr>
+            <w:r>
+              <w:rPr>
+                <w:rFonts w:ascii="Calibri" w:cs="Calibri" w:eastAsia="Calibri" w:hAnsi="Calibri"/>
+                <w:sz w:val="20"/>
+                <w:szCs w:val="20"/>
+              </w:rPr>
+              <w:t xml:space="preserve">10,5%</w:t>
+            </w:r>
+          </w:p>
+        </w:tc>
+        <w:tc>
+          <w:tcPr>
+            <w:tcW w:type="dxa" w:w="1500"/>
+            <w:tcMar>
+              <w:top w:type="dxa" w:w="40"/>
+              <w:left w:type="dxa" w:w="80"/>
+              <w:bottom w:type="dxa" w:w="40"/>
+              <w:right w:type="dxa" w:w="80"/>
+            </w:tcMar>
+          </w:tcPr>
+          <w:p>
+            <w:pPr>
+              <w:jc w:val="center"/>
+            </w:pPr>
+            <w:r>
+              <w:rPr>
+                <w:rFonts w:ascii="Calibri" w:cs="Calibri" w:eastAsia="Calibri" w:hAnsi="Calibri"/>
+                <w:sz w:val="20"/>
+                <w:szCs w:val="20"/>
+              </w:rPr>
+              <w:t xml:space="preserve">4,27</w:t>
+            </w:r>
+          </w:p>
+        </w:tc>
+      </w:tr>
+      <w:tr>
+        <w:tc>
+          <w:tcPr>
+            <w:tcW w:type="dxa" w:w="2600"/>
+            <w:tcMar>
+              <w:top w:type="dxa" w:w="40"/>
+              <w:left w:type="dxa" w:w="80"/>
+              <w:bottom w:type="dxa" w:w="40"/>
+              <w:right w:type="dxa" w:w="80"/>
+            </w:tcMar>
+          </w:tcPr>
+          <w:p>
+            <w:pPr>
+              <w:jc w:val="left"/>
+            </w:pPr>
+            <w:r>
+              <w:rPr>
+                <w:rFonts w:ascii="Calibri" w:cs="Calibri" w:eastAsia="Calibri" w:hAnsi="Calibri"/>
+                <w:sz w:val="20"/>
+                <w:szCs w:val="20"/>
+              </w:rPr>
+              <w:t xml:space="preserve">SMD</w:t>
+            </w:r>
+          </w:p>
+        </w:tc>
+        <w:tc>
+          <w:tcPr>
+            <w:tcW w:type="dxa" w:w="2100"/>
+            <w:tcMar>
+              <w:top w:type="dxa" w:w="40"/>
+              <w:left w:type="dxa" w:w="80"/>
+              <w:bottom w:type="dxa" w:w="40"/>
+              <w:right w:type="dxa" w:w="80"/>
+            </w:tcMar>
+          </w:tcPr>
+          <w:p>
+            <w:pPr>
+              <w:jc w:val="center"/>
+            </w:pPr>
+            <w:r>
+              <w:rPr>
+                <w:rFonts w:ascii="Calibri" w:cs="Calibri" w:eastAsia="Calibri" w:hAnsi="Calibri"/>
+                <w:sz w:val="20"/>
+                <w:szCs w:val="20"/>
+              </w:rPr>
+              <w:t xml:space="preserve">0,37%</w:t>
+            </w:r>
+          </w:p>
+        </w:tc>
+        <w:tc>
+          <w:tcPr>
+            <w:tcW w:type="dxa" w:w="1400"/>
+            <w:tcMar>
+              <w:top w:type="dxa" w:w="40"/>
+              <w:left w:type="dxa" w:w="80"/>
+              <w:bottom w:type="dxa" w:w="40"/>
+              <w:right w:type="dxa" w:w="80"/>
+            </w:tcMar>
+          </w:tcPr>
+          <w:p>
+            <w:pPr>
+              <w:jc w:val="center"/>
+            </w:pPr>
+            <w:r>
+              <w:rPr>
+                <w:rFonts w:ascii="Calibri" w:cs="Calibri" w:eastAsia="Calibri" w:hAnsi="Calibri"/>
+                <w:sz w:val="20"/>
+                <w:szCs w:val="20"/>
+              </w:rPr>
+              <w:t xml:space="preserve">38,3%</w:t>
+            </w:r>
+          </w:p>
+        </w:tc>
+        <w:tc>
+          <w:tcPr>
+            <w:tcW w:type="dxa" w:w="1400"/>
+            <w:tcMar>
+              <w:top w:type="dxa" w:w="40"/>
+              <w:left w:type="dxa" w:w="80"/>
+              <w:bottom w:type="dxa" w:w="40"/>
+              <w:right w:type="dxa" w:w="80"/>
+            </w:tcMar>
+          </w:tcPr>
+          <w:p>
+            <w:pPr>
+              <w:jc w:val="center"/>
+            </w:pPr>
+            <w:r>
+              <w:rPr>
+                <w:rFonts w:ascii="Calibri" w:cs="Calibri" w:eastAsia="Calibri" w:hAnsi="Calibri"/>
+                <w:sz w:val="20"/>
+                <w:szCs w:val="20"/>
+              </w:rPr>
+              <w:t xml:space="preserve">10,4%</w:t>
+            </w:r>
+          </w:p>
+        </w:tc>
+        <w:tc>
+          <w:tcPr>
+            <w:tcW w:type="dxa" w:w="1500"/>
+            <w:tcMar>
+              <w:top w:type="dxa" w:w="40"/>
+              <w:left w:type="dxa" w:w="80"/>
+              <w:bottom w:type="dxa" w:w="40"/>
+              <w:right w:type="dxa" w:w="80"/>
+            </w:tcMar>
+          </w:tcPr>
+          <w:p>
+            <w:pPr>
+              <w:jc w:val="center"/>
+            </w:pPr>
+            <w:r>
+              <w:rPr>
+                <w:rFonts w:ascii="Calibri" w:cs="Calibri" w:eastAsia="Calibri" w:hAnsi="Calibri"/>
+                <w:sz w:val="20"/>
+                <w:szCs w:val="20"/>
+              </w:rPr>
+              <w:t xml:space="preserve">7,71</w:t>
+            </w:r>
+          </w:p>
+        </w:tc>
+      </w:tr>
+      <w:tr>
+        <w:tc>
+          <w:tcPr>
+            <w:tcW w:type="dxa" w:w="2600"/>
+            <w:tcMar>
+              <w:top w:type="dxa" w:w="40"/>
+              <w:left w:type="dxa" w:w="80"/>
+              <w:bottom w:type="dxa" w:w="40"/>
+              <w:right w:type="dxa" w:w="80"/>
+            </w:tcMar>
+          </w:tcPr>
+          <w:p>
+            <w:pPr>
+              <w:jc w:val="left"/>
+            </w:pPr>
+            <w:r>
+              <w:rPr>
+                <w:rFonts w:ascii="Calibri" w:cs="Calibri" w:eastAsia="Calibri" w:hAnsi="Calibri"/>
+                <w:sz w:val="20"/>
+                <w:szCs w:val="20"/>
+              </w:rPr>
+              <w:t xml:space="preserve">SeaShips</w:t>
+            </w:r>
+          </w:p>
+        </w:tc>
+        <w:tc>
+          <w:tcPr>
+            <w:tcW w:type="dxa" w:w="2100"/>
+            <w:tcMar>
+              <w:top w:type="dxa" w:w="40"/>
+              <w:left w:type="dxa" w:w="80"/>
+              <w:bottom w:type="dxa" w:w="40"/>
+              <w:right w:type="dxa" w:w="80"/>
+            </w:tcMar>
+          </w:tcPr>
+          <w:p>
+            <w:pPr>
+              <w:jc w:val="center"/>
+            </w:pPr>
+            <w:r>
+              <w:rPr>
+                <w:rFonts w:ascii="Calibri" w:cs="Calibri" w:eastAsia="Calibri" w:hAnsi="Calibri"/>
+                <w:sz w:val="20"/>
+                <w:szCs w:val="20"/>
+              </w:rPr>
+              <w:t xml:space="preserve">3,64%</w:t>
+            </w:r>
+          </w:p>
+        </w:tc>
+        <w:tc>
+          <w:tcPr>
+            <w:tcW w:type="dxa" w:w="1400"/>
+            <w:tcMar>
+              <w:top w:type="dxa" w:w="40"/>
+              <w:left w:type="dxa" w:w="80"/>
+              <w:bottom w:type="dxa" w:w="40"/>
+              <w:right w:type="dxa" w:w="80"/>
+            </w:tcMar>
+          </w:tcPr>
+          <w:p>
+            <w:pPr>
+              <w:jc w:val="center"/>
+            </w:pPr>
+            <w:r>
+              <w:rPr>
+                <w:rFonts w:ascii="Calibri" w:cs="Calibri" w:eastAsia="Calibri" w:hAnsi="Calibri"/>
+                <w:sz w:val="20"/>
+                <w:szCs w:val="20"/>
+              </w:rPr>
+              <w:t xml:space="preserve">4,3%</w:t>
+            </w:r>
+          </w:p>
+        </w:tc>
+        <w:tc>
+          <w:tcPr>
+            <w:tcW w:type="dxa" w:w="1400"/>
+            <w:tcMar>
+              <w:top w:type="dxa" w:w="40"/>
+              <w:left w:type="dxa" w:w="80"/>
+              <w:bottom w:type="dxa" w:w="40"/>
+              <w:right w:type="dxa" w:w="80"/>
+            </w:tcMar>
+          </w:tcPr>
+          <w:p>
+            <w:pPr>
+              <w:jc w:val="center"/>
+            </w:pPr>
+            <w:r>
+              <w:rPr>
+                <w:rFonts w:ascii="Calibri" w:cs="Calibri" w:eastAsia="Calibri" w:hAnsi="Calibri"/>
+                <w:b/>
+                <w:bCs/>
+                <w:sz w:val="20"/>
+                <w:szCs w:val="20"/>
+              </w:rPr>
+              <w:t xml:space="preserve">63,2%</w:t>
+            </w:r>
+          </w:p>
+        </w:tc>
+        <w:tc>
+          <w:tcPr>
+            <w:tcW w:type="dxa" w:w="1500"/>
+            <w:tcMar>
+              <w:top w:type="dxa" w:w="40"/>
+              <w:left w:type="dxa" w:w="80"/>
+              <w:bottom w:type="dxa" w:w="40"/>
+              <w:right w:type="dxa" w:w="80"/>
+            </w:tcMar>
+          </w:tcPr>
+          <w:p>
+            <w:pPr>
+              <w:jc w:val="center"/>
+            </w:pPr>
+            <w:r>
+              <w:rPr>
+                <w:rFonts w:ascii="Calibri" w:cs="Calibri" w:eastAsia="Calibri" w:hAnsi="Calibri"/>
+                <w:sz w:val="20"/>
+                <w:szCs w:val="20"/>
+              </w:rPr>
+              <w:t xml:space="preserve">1,32</w:t>
+            </w:r>
+          </w:p>
+        </w:tc>
+      </w:tr>
+      <w:tr>
+        <w:tc>
+          <w:tcPr>
+            <w:tcW w:type="dxa" w:w="2600"/>
+            <w:shd w:fill="fdecea" w:val="clear"/>
+            <w:tcMar>
+              <w:top w:type="dxa" w:w="40"/>
+              <w:left w:type="dxa" w:w="80"/>
+              <w:bottom w:type="dxa" w:w="40"/>
+              <w:right w:type="dxa" w:w="80"/>
+            </w:tcMar>
+          </w:tcPr>
+          <w:p>
+            <w:pPr>
+              <w:jc w:val="left"/>
+            </w:pPr>
+            <w:r>
+              <w:rPr>
+                <w:rFonts w:ascii="Calibri" w:cs="Calibri" w:eastAsia="Calibri" w:hAnsi="Calibri"/>
+                <w:sz w:val="20"/>
+                <w:szCs w:val="20"/>
+              </w:rPr>
+              <w:t xml:space="preserve">InaTechShips</w:t>
+            </w:r>
+          </w:p>
+        </w:tc>
+        <w:tc>
+          <w:tcPr>
+            <w:tcW w:type="dxa" w:w="2100"/>
+            <w:shd w:fill="fdecea" w:val="clear"/>
+            <w:tcMar>
+              <w:top w:type="dxa" w:w="40"/>
+              <w:left w:type="dxa" w:w="80"/>
+              <w:bottom w:type="dxa" w:w="40"/>
+              <w:right w:type="dxa" w:w="80"/>
+            </w:tcMar>
+          </w:tcPr>
+          <w:p>
+            <w:pPr>
+              <w:jc w:val="center"/>
+            </w:pPr>
+            <w:r>
+              <w:rPr>
+                <w:rFonts w:ascii="Calibri" w:cs="Calibri" w:eastAsia="Calibri" w:hAnsi="Calibri"/>
+                <w:sz w:val="20"/>
+                <w:szCs w:val="20"/>
+              </w:rPr>
+              <w:t xml:space="preserve">32,09%</w:t>
+            </w:r>
+          </w:p>
+        </w:tc>
+        <w:tc>
+          <w:tcPr>
+            <w:tcW w:type="dxa" w:w="1400"/>
+            <w:shd w:fill="fdecea" w:val="clear"/>
+            <w:tcMar>
+              <w:top w:type="dxa" w:w="40"/>
+              <w:left w:type="dxa" w:w="80"/>
+              <w:bottom w:type="dxa" w:w="40"/>
+              <w:right w:type="dxa" w:w="80"/>
+            </w:tcMar>
+          </w:tcPr>
+          <w:p>
+            <w:pPr>
+              <w:jc w:val="center"/>
+            </w:pPr>
+            <w:r>
+              <w:rPr>
+                <w:rFonts w:ascii="Calibri" w:cs="Calibri" w:eastAsia="Calibri" w:hAnsi="Calibri"/>
+                <w:sz w:val="20"/>
+                <w:szCs w:val="20"/>
+              </w:rPr>
+              <w:t xml:space="preserve">0,0%</w:t>
+            </w:r>
+          </w:p>
+        </w:tc>
+        <w:tc>
+          <w:tcPr>
+            <w:tcW w:type="dxa" w:w="1400"/>
+            <w:shd w:fill="fdecea" w:val="clear"/>
+            <w:tcMar>
+              <w:top w:type="dxa" w:w="40"/>
+              <w:left w:type="dxa" w:w="80"/>
+              <w:bottom w:type="dxa" w:w="40"/>
+              <w:right w:type="dxa" w:w="80"/>
+            </w:tcMar>
+          </w:tcPr>
+          <w:p>
+            <w:pPr>
+              <w:jc w:val="center"/>
+            </w:pPr>
+            <w:r>
+              <w:rPr>
+                <w:rFonts w:ascii="Calibri" w:cs="Calibri" w:eastAsia="Calibri" w:hAnsi="Calibri"/>
+                <w:b/>
+                <w:bCs/>
+                <w:sz w:val="20"/>
+                <w:szCs w:val="20"/>
+              </w:rPr>
+              <w:t xml:space="preserve">100%</w:t>
+            </w:r>
+          </w:p>
+        </w:tc>
+        <w:tc>
+          <w:tcPr>
+            <w:tcW w:type="dxa" w:w="1500"/>
+            <w:shd w:fill="fdecea" w:val="clear"/>
+            <w:tcMar>
+              <w:top w:type="dxa" w:w="40"/>
+              <w:left w:type="dxa" w:w="80"/>
+              <w:bottom w:type="dxa" w:w="40"/>
+              <w:right w:type="dxa" w:w="80"/>
+            </w:tcMar>
+          </w:tcPr>
+          <w:p>
+            <w:pPr>
+              <w:jc w:val="center"/>
+            </w:pPr>
+            <w:r>
+              <w:rPr>
+                <w:rFonts w:ascii="Calibri" w:cs="Calibri" w:eastAsia="Calibri" w:hAnsi="Calibri"/>
+                <w:sz w:val="20"/>
+                <w:szCs w:val="20"/>
+              </w:rPr>
+              <w:t xml:space="preserve">1,00</w:t>
+            </w:r>
+          </w:p>
+        </w:tc>
+      </w:tr>
+    </w:tbl>
+    <w:p>
+      <w:pPr>
+        <w:spacing w:after="120" w:before="0"/>
+        <w:jc w:val="center"/>
+      </w:pPr>
+      <w:r>
+        <w:rPr>
+          <w:rFonts w:ascii="Calibri" w:cs="Calibri" w:eastAsia="Calibri" w:hAnsi="Calibri"/>
+          <w:i/>
+          <w:iCs/>
+          <w:sz w:val="18"/>
+          <w:szCs w:val="18"/>
+        </w:rPr>
+        <w:t xml:space="preserve">Tabela 1. Perfil de tamanho dos datasets (COCO a 640×640). Ordenados por escala: à medida que a área mediana cresce, a proporção de embarcações pequenas cai e a de grandes sobe. O CITRA (alvo) tem as menores embarcações (71,6% pequenas); o InaTechShips, as maiores (100% grandes, nenhuma pequena) — cerca de 324× maiores que as do CITRA.</w:t>
       </w:r>
     </w:p>
     <w:p>
@@ -1589,7 +2398,7 @@
       <w:r>
         <w:drawing>
           <wp:inline distT="0" distB="0" distL="0" distR="0">
-            <wp:extent cx="5334000" cy="1847850"/>
+            <wp:extent cx="5429250" cy="1952625"/>
             <wp:effectExtent t="0" r="0" b="0" l="0"/>
             <wp:docPr id="1" name="" descr="" title=""/>
             <wp:cNvGraphicFramePr>
@@ -1614,7 +2423,7 @@
                   <pic:spPr bwMode="auto">
                     <a:xfrm>
                       <a:off x="0" y="0"/>
-                      <a:ext cx="5334000" cy="1847850"/>
+                      <a:ext cx="5429250" cy="1952625"/>
                     </a:xfrm>
                     <a:prstGeom prst="rect">
                       <a:avLst/>
@@ -1640,7 +2449,7 @@
           <w:sz w:val="18"/>
           <w:szCs w:val="18"/>
         </w:rPr>
-        <w:t xml:space="preserve">Figura 2. O CITRA é dominado por embarcações pequenas (área mediana 0,10% da imagem); o SeaShips, por embarcações grandes (3,64% — cerca de 36× maiores).</w:t>
+        <w:t xml:space="preserve">Figura 2. O eixo de escala dos datasets. À esquerda, a distribuição de tamanho (a barra do CITRA é dominada por pequenas; a do InaTechShips, inteiramente grandes). À direita, a área mediana em escala logarítmica — a progressão de escala do domínio operacional (CITRA) até a fonte mais distante (InaTechShips).</w:t>
       </w:r>
     </w:p>
     <w:p>
@@ -1650,12 +2459,10 @@
       <w:r>
         <w:rPr>
           <w:rFonts w:ascii="Calibri" w:cs="Calibri" w:eastAsia="Calibri" w:hAnsi="Calibri"/>
-          <w:b/>
-          <w:bCs/>
           <w:sz w:val="22"/>
           <w:szCs w:val="22"/>
         </w:rPr>
-        <w:t xml:space="preserve">O mecanismo fica claro:</w:t>
+        <w:t xml:space="preserve">A ordem por escala nesta tabela é a mesma da distância estrutural medida (CITRA &lt; ABOShips &lt; SMD &lt; SeaShips &lt; InaTechShips): a escala é o eixo dominante que separa os domínios. Voltando à inversão de desempenho, o mecanismo fica claro:</w:t>
       </w:r>
     </w:p>
     <w:p>

</xml_diff>